<commit_message>
docs: rebuild ER/DFD as real portrait diagrams; one-diagram-per-page Word files
</commit_message>
<xml_diff>
--- a/documentation/CHAPTER_6_DFD_Diagrams_RakshaSafe.docx
+++ b/documentation/CHAPTER_6_DFD_Diagrams_RakshaSafe.docx
@@ -863,7 +863,7 @@
       <w:r>
         <w:drawing>
           <wp:inline xmlns:a="http://schemas.openxmlformats.org/drawingml/2006/main" xmlns:pic="http://schemas.openxmlformats.org/drawingml/2006/picture">
-            <wp:extent cx="6120000" cy="3803696"/>
+            <wp:extent cx="6120000" cy="2528681"/>
             <wp:docPr id="1" name="Picture 1"/>
             <wp:cNvGraphicFramePr>
               <a:graphicFrameLocks noChangeAspect="1"/>
@@ -884,7 +884,7 @@
                   <pic:spPr>
                     <a:xfrm>
                       <a:off x="0" y="0"/>
-                      <a:ext cx="6120000" cy="3803696"/>
+                      <a:ext cx="6120000" cy="2528681"/>
                     </a:xfrm>
                     <a:prstGeom prst="rect"/>
                   </pic:spPr>
@@ -981,7 +981,7 @@
       <w:r>
         <w:drawing>
           <wp:inline xmlns:a="http://schemas.openxmlformats.org/drawingml/2006/main" xmlns:pic="http://schemas.openxmlformats.org/drawingml/2006/picture">
-            <wp:extent cx="6120000" cy="4810784"/>
+            <wp:extent cx="5168571" cy="6660000"/>
             <wp:docPr id="2" name="Picture 2"/>
             <wp:cNvGraphicFramePr>
               <a:graphicFrameLocks noChangeAspect="1"/>
@@ -1002,7 +1002,7 @@
                   <pic:spPr>
                     <a:xfrm>
                       <a:off x="0" y="0"/>
-                      <a:ext cx="6120000" cy="4810784"/>
+                      <a:ext cx="5168571" cy="6660000"/>
                     </a:xfrm>
                     <a:prstGeom prst="rect"/>
                   </pic:spPr>
@@ -1099,7 +1099,7 @@
       <w:r>
         <w:drawing>
           <wp:inline xmlns:a="http://schemas.openxmlformats.org/drawingml/2006/main" xmlns:pic="http://schemas.openxmlformats.org/drawingml/2006/picture">
-            <wp:extent cx="6120000" cy="4686835"/>
+            <wp:extent cx="6120000" cy="2234642"/>
             <wp:docPr id="3" name="Picture 3"/>
             <wp:cNvGraphicFramePr>
               <a:graphicFrameLocks noChangeAspect="1"/>
@@ -1120,7 +1120,7 @@
                   <pic:spPr>
                     <a:xfrm>
                       <a:off x="0" y="0"/>
-                      <a:ext cx="6120000" cy="4686835"/>
+                      <a:ext cx="6120000" cy="2234642"/>
                     </a:xfrm>
                     <a:prstGeom prst="rect"/>
                   </pic:spPr>
@@ -1217,7 +1217,7 @@
       <w:r>
         <w:drawing>
           <wp:inline xmlns:a="http://schemas.openxmlformats.org/drawingml/2006/main" xmlns:pic="http://schemas.openxmlformats.org/drawingml/2006/picture">
-            <wp:extent cx="6120000" cy="4555139"/>
+            <wp:extent cx="4300994" cy="6660000"/>
             <wp:docPr id="4" name="Picture 4"/>
             <wp:cNvGraphicFramePr>
               <a:graphicFrameLocks noChangeAspect="1"/>
@@ -1238,7 +1238,7 @@
                   <pic:spPr>
                     <a:xfrm>
                       <a:off x="0" y="0"/>
-                      <a:ext cx="6120000" cy="4555139"/>
+                      <a:ext cx="4300994" cy="6660000"/>
                     </a:xfrm>
                     <a:prstGeom prst="rect"/>
                   </pic:spPr>
@@ -1335,7 +1335,7 @@
       <w:r>
         <w:drawing>
           <wp:inline xmlns:a="http://schemas.openxmlformats.org/drawingml/2006/main" xmlns:pic="http://schemas.openxmlformats.org/drawingml/2006/picture">
-            <wp:extent cx="6120000" cy="4307240"/>
+            <wp:extent cx="6120000" cy="4042199"/>
             <wp:docPr id="5" name="Picture 5"/>
             <wp:cNvGraphicFramePr>
               <a:graphicFrameLocks noChangeAspect="1"/>
@@ -1356,7 +1356,7 @@
                   <pic:spPr>
                     <a:xfrm>
                       <a:off x="0" y="0"/>
-                      <a:ext cx="6120000" cy="4307240"/>
+                      <a:ext cx="6120000" cy="4042199"/>
                     </a:xfrm>
                     <a:prstGeom prst="rect"/>
                   </pic:spPr>

</xml_diff>